<commit_message>
Deliver clean Fase I-III Word docs with proper Spanish encoding
Keep Fase I based on the original proposal with sole author Franly Marroquin, replace informal cumulative drafts with formal Fase II/III delivery documents, refresh UI prototypes, and remove temporary extract files.

Co-authored-by: Cursor <cursoragent@cursor.com>
</commit_message>
<xml_diff>
--- a/documentacion/Fase-I/CompraLatino_Fase_I_Propuesta_de_Arquitectura.docx
+++ b/documentacion/Fase-I/CompraLatino_Fase_I_Propuesta_de_Arquitectura.docx
@@ -1,5 +1,29 @@
 
-<file path=word/document.xml><?xml version="1.0" encoding="utf-8"?>
+<file path=docProps\app.xml><?xml version="1.0" encoding="utf-8"?>
+<Properties xmlns="http://schemas.openxmlformats.org/officeDocument/2006/extended-properties" xmlns:vt="http://schemas.openxmlformats.org/officeDocument/2006/docPropsVTypes"/>
+</file>
+
+<file path=docProps\core.xml><?xml version="1.0" encoding="utf-8"?>
+<cp:coreProperties xmlns:cp="http://schemas.openxmlformats.org/package/2006/metadata/core-properties" xmlns:dc="http://purl.org/dc/elements/1.1/" xmlns:dcterms="http://purl.org/dc/terms/" xmlns:dcmitype="http://purl.org/dc/dcmitype/" xmlns:xsi="http://www.w3.org/2001/XMLSchema-instance">
+  <dc:title>Propuesta de arquitectura de software para la plataforma CompraLatino — Fase I</dc:title>
+  <dc:creator>Grupo de trabajo CompraLatino</dc:creator>
+  <dc:description>SRS, estudio de viabilidad y plan del proyecto. Arquitectura Next.js, Firebase, ASP.NET Core, SQL Server y Wompi.</dc:description>
+  <cp:lastModifiedBy>Un-named</cp:lastModifiedBy>
+  <cp:revision>1</cp:revision>
+  <dcterms:created xsi:type="dcterms:W3CDTF">2026-08-20T22:57:29.197Z</dcterms:created>
+  <dcterms:modified xsi:type="dcterms:W3CDTF">2026-08-20T22:57:29.198Z</dcterms:modified>
+</cp:coreProperties>
+</file>
+
+<file path=docProps\custom.xml><?xml version="1.0" encoding="utf-8"?>
+<Properties xmlns="http://schemas.openxmlformats.org/officeDocument/2006/custom-properties" xmlns:vt="http://schemas.openxmlformats.org/officeDocument/2006/docPropsVTypes"/>
+</file>
+
+<file path=word\comments.xml><?xml version="1.0" encoding="utf-8"?>
+<w:comments xmlns:cx="http://schemas.microsoft.com/office/drawing/2014/chartex" xmlns:cx1="http://schemas.microsoft.com/office/drawing/2015/9/8/chartex" xmlns:cx2="http://schemas.microsoft.com/office/drawing/2015/10/21/chartex" xmlns:cx3="http://schemas.microsoft.com/office/drawing/2016/5/9/chartex" xmlns:cx4="http://schemas.microsoft.com/office/drawing/2016/5/10/chartex" xmlns:cx5="http://schemas.microsoft.com/office/drawing/2016/5/11/chartex" xmlns:cx6="http://schemas.microsoft.com/office/drawing/2016/5/12/chartex" xmlns:cx7="http://schemas.microsoft.com/office/drawing/2016/5/13/chartex" xmlns:cx8="http://schemas.microsoft.com/office/drawing/2016/5/14/chartex" xmlns:mc="http://schemas.openxmlformats.org/markup-compatibility/2006" xmlns:aink="http://schemas.microsoft.com/office/drawing/2016/ink" xmlns:am3d="http://schemas.microsoft.com/office/drawing/2017/model3d" xmlns:o="urn:schemas-microsoft-com:office:office" xmlns:r="http://schemas.openxmlformats.org/officeDocument/2006/relationships" xmlns:m="http://schemas.openxmlformats.org/officeDocument/2006/math" xmlns:v="urn:schemas-microsoft-com:vml" xmlns:wp14="http://schemas.microsoft.com/office/word/2010/wordprocessingDrawing" xmlns:wp="http://schemas.openxmlformats.org/drawingml/2006/wordprocessingDrawing" xmlns:w10="urn:schemas-microsoft-com:office:word" xmlns:w="http://schemas.openxmlformats.org/wordprocessingml/2006/main" xmlns:w14="http://schemas.microsoft.com/office/word/2010/wordml" xmlns:w15="http://schemas.microsoft.com/office/word/2012/wordml" xmlns:w16cex="http://schemas.microsoft.com/office/word/2018/wordml/cex" xmlns:w16cid="http://schemas.microsoft.com/office/word/2016/wordml/cid" xmlns:w16="http://schemas.microsoft.com/office/word/2018/wordml" xmlns:w16sdtdh="http://schemas.microsoft.com/office/word/2020/wordml/sdtdatahash" xmlns:w16se="http://schemas.microsoft.com/office/word/2015/wordml/symex" xmlns:wpg="http://schemas.microsoft.com/office/word/2010/wordprocessingGroup" xmlns:wpi="http://schemas.microsoft.com/office/word/2010/wordprocessingInk" xmlns:wne="http://schemas.microsoft.com/office/word/2006/wordml" xmlns:wps="http://schemas.microsoft.com/office/word/2010/wordprocessingShape"/>
+</file>
+
+<file path=word\document.xml><?xml version="1.0" encoding="utf-8"?>
 <w:document xmlns:wpc="http://schemas.microsoft.com/office/word/2010/wordprocessingCanvas" xmlns:mc="http://schemas.openxmlformats.org/markup-compatibility/2006" xmlns:o="urn:schemas-microsoft-com:office:office" xmlns:r="http://schemas.openxmlformats.org/officeDocument/2006/relationships" xmlns:m="http://schemas.openxmlformats.org/officeDocument/2006/math" xmlns:v="urn:schemas-microsoft-com:vml" xmlns:wp14="http://schemas.microsoft.com/office/word/2010/wordprocessingDrawing" xmlns:wp="http://schemas.openxmlformats.org/drawingml/2006/wordprocessingDrawing" xmlns:w10="urn:schemas-microsoft-com:office:word" xmlns:w="http://schemas.openxmlformats.org/wordprocessingml/2006/main" xmlns:w14="http://schemas.microsoft.com/office/word/2010/wordml" xmlns:w15="http://schemas.microsoft.com/office/word/2012/wordml" xmlns:wpg="http://schemas.microsoft.com/office/word/2010/wordprocessingGroup" xmlns:wpi="http://schemas.microsoft.com/office/word/2010/wordprocessingInk" xmlns:wne="http://schemas.microsoft.com/office/word/2006/wordml" xmlns:wps="http://schemas.microsoft.com/office/word/2010/wordprocessingShape" xmlns:cx="http://schemas.microsoft.com/office/drawing/2014/chartex" xmlns:cx1="http://schemas.microsoft.com/office/drawing/2015/9/8/chartex" xmlns:cx2="http://schemas.microsoft.com/office/drawing/2015/10/21/chartex" xmlns:cx3="http://schemas.microsoft.com/office/drawing/2016/5/9/chartex" xmlns:cx4="http://schemas.microsoft.com/office/drawing/2016/5/10/chartex" xmlns:cx5="http://schemas.microsoft.com/office/drawing/2016/5/11/chartex" xmlns:cx6="http://schemas.microsoft.com/office/drawing/2016/5/12/chartex" xmlns:cx7="http://schemas.microsoft.com/office/drawing/2016/5/13/chartex" xmlns:cx8="http://schemas.microsoft.com/office/drawing/2016/5/14/chartex" xmlns:aink="http://schemas.microsoft.com/office/drawing/2016/ink" xmlns:am3d="http://schemas.microsoft.com/office/drawing/2017/model3d" xmlns:w16cex="http://schemas.microsoft.com/office/word/2018/wordml/cex" xmlns:w16cid="http://schemas.microsoft.com/office/word/2016/wordml/cid" xmlns:w16="http://schemas.microsoft.com/office/word/2018/wordml" xmlns:w16sdtdh="http://schemas.microsoft.com/office/word/2020/wordml/sdtdatahash" xmlns:w16se="http://schemas.microsoft.com/office/word/2015/wordml/symex" mc:Ignorable="w14 w15 wp14">
   <w:body>
     <w:p>
@@ -45,7 +69,7 @@
           <w:sz w:val="24"/>
           <w:szCs w:val="24"/>
         </w:rPr>
-        <w:t xml:space="preserve">NOMBRE DE LA UNIVERSIDAD</w:t>
+        <w:t xml:space="preserve">Universidad Don Bosco</w:t>
       </w:r>
     </w:p>
     <w:p>
@@ -229,7 +253,7 @@
           <w:sz w:val="24"/>
           <w:szCs w:val="24"/>
         </w:rPr>
-        <w:t xml:space="preserve">Integrantes del grupo de trabajo</w:t>
+        <w:t xml:space="preserve">Integrante</w:t>
       </w:r>
     </w:p>
     <w:p>
@@ -247,7 +271,7 @@
           <w:sz w:val="24"/>
           <w:szCs w:val="24"/>
         </w:rPr>
-        <w:t xml:space="preserve">Apellido, Nombre del integrante 1</w:t>
+        <w:t xml:space="preserve">Marroquín, Franly Azael</w:t>
       </w:r>
     </w:p>
     <w:p>
@@ -265,7 +289,7 @@
           <w:sz w:val="24"/>
           <w:szCs w:val="24"/>
         </w:rPr>
-        <w:t xml:space="preserve">Apellido, Nombre del integrante 2</w:t>
+        <w:t xml:space="preserve"/>
       </w:r>
     </w:p>
     <w:p>
@@ -283,7 +307,7 @@
           <w:sz w:val="24"/>
           <w:szCs w:val="24"/>
         </w:rPr>
-        <w:t xml:space="preserve">Apellido, Nombre del integrante 3</w:t>
+        <w:t xml:space="preserve"/>
       </w:r>
     </w:p>
     <w:p>
@@ -13345,11 +13369,7 @@
 </w:document>
 </file>
 
-<file path=word/comments.xml><?xml version="1.0" encoding="utf-8"?>
-<w:comments xmlns:cx="http://schemas.microsoft.com/office/drawing/2014/chartex" xmlns:cx1="http://schemas.microsoft.com/office/drawing/2015/9/8/chartex" xmlns:cx2="http://schemas.microsoft.com/office/drawing/2015/10/21/chartex" xmlns:cx3="http://schemas.microsoft.com/office/drawing/2016/5/9/chartex" xmlns:cx4="http://schemas.microsoft.com/office/drawing/2016/5/10/chartex" xmlns:cx5="http://schemas.microsoft.com/office/drawing/2016/5/11/chartex" xmlns:cx6="http://schemas.microsoft.com/office/drawing/2016/5/12/chartex" xmlns:cx7="http://schemas.microsoft.com/office/drawing/2016/5/13/chartex" xmlns:cx8="http://schemas.microsoft.com/office/drawing/2016/5/14/chartex" xmlns:mc="http://schemas.openxmlformats.org/markup-compatibility/2006" xmlns:aink="http://schemas.microsoft.com/office/drawing/2016/ink" xmlns:am3d="http://schemas.microsoft.com/office/drawing/2017/model3d" xmlns:o="urn:schemas-microsoft-com:office:office" xmlns:r="http://schemas.openxmlformats.org/officeDocument/2006/relationships" xmlns:m="http://schemas.openxmlformats.org/officeDocument/2006/math" xmlns:v="urn:schemas-microsoft-com:vml" xmlns:wp14="http://schemas.microsoft.com/office/word/2010/wordprocessingDrawing" xmlns:wp="http://schemas.openxmlformats.org/drawingml/2006/wordprocessingDrawing" xmlns:w10="urn:schemas-microsoft-com:office:word" xmlns:w="http://schemas.openxmlformats.org/wordprocessingml/2006/main" xmlns:w14="http://schemas.microsoft.com/office/word/2010/wordml" xmlns:w15="http://schemas.microsoft.com/office/word/2012/wordml" xmlns:w16cex="http://schemas.microsoft.com/office/word/2018/wordml/cex" xmlns:w16cid="http://schemas.microsoft.com/office/word/2016/wordml/cid" xmlns:w16="http://schemas.microsoft.com/office/word/2018/wordml" xmlns:w16sdtdh="http://schemas.microsoft.com/office/word/2020/wordml/sdtdatahash" xmlns:w16se="http://schemas.microsoft.com/office/word/2015/wordml/symex" xmlns:wpg="http://schemas.microsoft.com/office/word/2010/wordprocessingGroup" xmlns:wpi="http://schemas.microsoft.com/office/word/2010/wordprocessingInk" xmlns:wne="http://schemas.microsoft.com/office/word/2006/wordml" xmlns:wps="http://schemas.microsoft.com/office/word/2010/wordprocessingShape"/>
-</file>
-
-<file path=word/endnotes.xml><?xml version="1.0" encoding="utf-8"?>
+<file path=word\endnotes.xml><?xml version="1.0" encoding="utf-8"?>
 <w:endnotes xmlns:wpc="http://schemas.microsoft.com/office/word/2010/wordprocessingCanvas" xmlns:mc="http://schemas.openxmlformats.org/markup-compatibility/2006" xmlns:o="urn:schemas-microsoft-com:office:office" xmlns:r="http://schemas.openxmlformats.org/officeDocument/2006/relationships" xmlns:m="http://schemas.openxmlformats.org/officeDocument/2006/math" xmlns:v="urn:schemas-microsoft-com:vml" xmlns:wp14="http://schemas.microsoft.com/office/word/2010/wordprocessingDrawing" xmlns:wp="http://schemas.openxmlformats.org/drawingml/2006/wordprocessingDrawing" xmlns:w10="urn:schemas-microsoft-com:office:word" xmlns:w="http://schemas.openxmlformats.org/wordprocessingml/2006/main" xmlns:w14="http://schemas.microsoft.com/office/word/2010/wordml" xmlns:w15="http://schemas.microsoft.com/office/word/2012/wordml" xmlns:wpg="http://schemas.microsoft.com/office/word/2010/wordprocessingGroup" xmlns:wpi="http://schemas.microsoft.com/office/word/2010/wordprocessingInk" xmlns:wne="http://schemas.microsoft.com/office/word/2006/wordml" xmlns:wps="http://schemas.microsoft.com/office/word/2010/wordprocessingShape" mc:Ignorable="w14 w15 wp14">
   <w:endnote w:type="separator" w:id="-1">
     <w:p>
@@ -13386,7 +13406,11 @@
 </w:endnotes>
 </file>
 
-<file path=word/footer1.xml><?xml version="1.0" encoding="utf-8"?>
+<file path=word\fontTable.xml><?xml version="1.0" encoding="utf-8"?>
+<w:fonts xmlns:mc="http://schemas.openxmlformats.org/markup-compatibility/2006" xmlns:r="http://schemas.openxmlformats.org/officeDocument/2006/relationships" xmlns:w="http://schemas.openxmlformats.org/wordprocessingml/2006/main" xmlns:w14="http://schemas.microsoft.com/office/word/2010/wordml" xmlns:w15="http://schemas.microsoft.com/office/word/2012/wordml" xmlns:w16cex="http://schemas.microsoft.com/office/word/2018/wordml/cex" xmlns:w16cid="http://schemas.microsoft.com/office/word/2016/wordml/cid" xmlns:w16="http://schemas.microsoft.com/office/word/2018/wordml" xmlns:w16sdtdh="http://schemas.microsoft.com/office/word/2020/wordml/sdtdatahash" xmlns:w16se="http://schemas.microsoft.com/office/word/2015/wordml/symex" mc:Ignorable="w14 w15 w16se w16cid w16 w16cex w16sdtdh"/>
+</file>
+
+<file path=word\footer1.xml><?xml version="1.0" encoding="utf-8"?>
 <w:ftr xmlns:wpc="http://schemas.microsoft.com/office/word/2010/wordprocessingCanvas" xmlns:mc="http://schemas.openxmlformats.org/markup-compatibility/2006" xmlns:o="urn:schemas-microsoft-com:office:office" xmlns:r="http://schemas.openxmlformats.org/officeDocument/2006/relationships" xmlns:m="http://schemas.openxmlformats.org/officeDocument/2006/math" xmlns:v="urn:schemas-microsoft-com:vml" xmlns:wp14="http://schemas.microsoft.com/office/word/2010/wordprocessingDrawing" xmlns:wp="http://schemas.openxmlformats.org/drawingml/2006/wordprocessingDrawing" xmlns:w10="urn:schemas-microsoft-com:office:word" xmlns:w="http://schemas.openxmlformats.org/wordprocessingml/2006/main" xmlns:w14="http://schemas.microsoft.com/office/word/2010/wordml" xmlns:w15="http://schemas.microsoft.com/office/word/2012/wordml" xmlns:wpg="http://schemas.microsoft.com/office/word/2010/wordprocessingGroup" xmlns:wpi="http://schemas.microsoft.com/office/word/2010/wordprocessingInk" xmlns:wne="http://schemas.microsoft.com/office/word/2006/wordml" xmlns:wps="http://schemas.microsoft.com/office/word/2010/wordprocessingShape">
   <w:p>
     <w:pPr>
@@ -13407,7 +13431,7 @@
 </w:ftr>
 </file>
 
-<file path=word/footnotes.xml><?xml version="1.0" encoding="utf-8"?>
+<file path=word\footnotes.xml><?xml version="1.0" encoding="utf-8"?>
 <w:footnotes xmlns:wpc="http://schemas.microsoft.com/office/word/2010/wordprocessingCanvas" xmlns:mc="http://schemas.openxmlformats.org/markup-compatibility/2006" xmlns:o="urn:schemas-microsoft-com:office:office" xmlns:r="http://schemas.openxmlformats.org/officeDocument/2006/relationships" xmlns:m="http://schemas.openxmlformats.org/officeDocument/2006/math" xmlns:v="urn:schemas-microsoft-com:vml" xmlns:wp14="http://schemas.microsoft.com/office/word/2010/wordprocessingDrawing" xmlns:wp="http://schemas.openxmlformats.org/drawingml/2006/wordprocessingDrawing" xmlns:w10="urn:schemas-microsoft-com:office:word" xmlns:w="http://schemas.openxmlformats.org/wordprocessingml/2006/main" xmlns:w14="http://schemas.microsoft.com/office/word/2010/wordml" xmlns:w15="http://schemas.microsoft.com/office/word/2012/wordml" xmlns:wpg="http://schemas.microsoft.com/office/word/2010/wordprocessingGroup" xmlns:wpi="http://schemas.microsoft.com/office/word/2010/wordprocessingInk" xmlns:wne="http://schemas.microsoft.com/office/word/2006/wordml" xmlns:wps="http://schemas.microsoft.com/office/word/2010/wordprocessingShape" mc:Ignorable="w14 w15 wp14">
   <w:footnote w:type="separator" w:id="-1">
     <w:p>
@@ -13444,7 +13468,7 @@
 </w:footnotes>
 </file>
 
-<file path=word/header1.xml><?xml version="1.0" encoding="utf-8"?>
+<file path=word\header1.xml><?xml version="1.0" encoding="utf-8"?>
 <w:hdr xmlns:wpc="http://schemas.microsoft.com/office/word/2010/wordprocessingCanvas" xmlns:mc="http://schemas.openxmlformats.org/markup-compatibility/2006" xmlns:o="urn:schemas-microsoft-com:office:office" xmlns:r="http://schemas.openxmlformats.org/officeDocument/2006/relationships" xmlns:m="http://schemas.openxmlformats.org/officeDocument/2006/math" xmlns:v="urn:schemas-microsoft-com:vml" xmlns:wp14="http://schemas.microsoft.com/office/word/2010/wordprocessingDrawing" xmlns:wp="http://schemas.openxmlformats.org/drawingml/2006/wordprocessingDrawing" xmlns:w10="urn:schemas-microsoft-com:office:word" xmlns:w="http://schemas.openxmlformats.org/wordprocessingml/2006/main" xmlns:w14="http://schemas.microsoft.com/office/word/2010/wordml" xmlns:w15="http://schemas.microsoft.com/office/word/2012/wordml" xmlns:wpg="http://schemas.microsoft.com/office/word/2010/wordprocessingGroup" xmlns:wpi="http://schemas.microsoft.com/office/word/2010/wordprocessingInk" xmlns:wne="http://schemas.microsoft.com/office/word/2006/wordml" xmlns:wps="http://schemas.microsoft.com/office/word/2010/wordprocessingShape" xmlns:cx="http://schemas.microsoft.com/office/drawing/2014/chartex" xmlns:cx1="http://schemas.microsoft.com/office/drawing/2015/9/8/chartex" xmlns:cx2="http://schemas.microsoft.com/office/drawing/2015/10/21/chartex" xmlns:cx3="http://schemas.microsoft.com/office/drawing/2016/5/9/chartex" xmlns:cx4="http://schemas.microsoft.com/office/drawing/2016/5/10/chartex" xmlns:cx5="http://schemas.microsoft.com/office/drawing/2016/5/11/chartex" xmlns:cx6="http://schemas.microsoft.com/office/drawing/2016/5/12/chartex" xmlns:cx7="http://schemas.microsoft.com/office/drawing/2016/5/13/chartex" xmlns:cx8="http://schemas.microsoft.com/office/drawing/2016/5/14/chartex" xmlns:w16cid="http://schemas.microsoft.com/office/word/2016/wordml/cid" xmlns:w16se="http://schemas.microsoft.com/office/word/2015/wordml/symex">
   <w:p>
     <w:pPr>
@@ -13484,7 +13508,7 @@
 </w:hdr>
 </file>
 
-<file path=word/numbering.xml><?xml version="1.0" encoding="utf-8"?>
+<file path=word\numbering.xml><?xml version="1.0" encoding="utf-8"?>
 <w:numbering xmlns:wpc="http://schemas.microsoft.com/office/word/2010/wordprocessingCanvas" xmlns:mc="http://schemas.openxmlformats.org/markup-compatibility/2006" xmlns:o="urn:schemas-microsoft-com:office:office" xmlns:r="http://schemas.openxmlformats.org/officeDocument/2006/relationships" xmlns:m="http://schemas.openxmlformats.org/officeDocument/2006/math" xmlns:v="urn:schemas-microsoft-com:vml" xmlns:wp14="http://schemas.microsoft.com/office/word/2010/wordprocessingDrawing" xmlns:wp="http://schemas.openxmlformats.org/drawingml/2006/wordprocessingDrawing" xmlns:w10="urn:schemas-microsoft-com:office:word" xmlns:w="http://schemas.openxmlformats.org/wordprocessingml/2006/main" xmlns:w14="http://schemas.microsoft.com/office/word/2010/wordml" xmlns:w15="http://schemas.microsoft.com/office/word/2012/wordml" xmlns:wpg="http://schemas.microsoft.com/office/word/2010/wordprocessingGroup" xmlns:wpi="http://schemas.microsoft.com/office/word/2010/wordprocessingInk" xmlns:wne="http://schemas.microsoft.com/office/word/2006/wordml" xmlns:wps="http://schemas.microsoft.com/office/word/2010/wordprocessingShape" mc:Ignorable="w14 w15 wp14">
   <w:abstractNum w:abstractNumId="1" w15:restartNumberingAfterBreak="0">
     <w:multiLevelType w:val="hybridMultilevel"/>
@@ -13609,7 +13633,17 @@
 </w:numbering>
 </file>
 
-<file path=word/styles.xml><?xml version="1.0" encoding="utf-8"?>
+<file path=word\settings.xml><?xml version="1.0" encoding="utf-8"?>
+<w:settings xmlns:wpc="http://schemas.microsoft.com/office/word/2010/wordprocessingCanvas" xmlns:mc="http://schemas.openxmlformats.org/markup-compatibility/2006" xmlns:o="urn:schemas-microsoft-com:office:office" xmlns:r="http://schemas.openxmlformats.org/officeDocument/2006/relationships" xmlns:m="http://schemas.openxmlformats.org/officeDocument/2006/math" xmlns:v="urn:schemas-microsoft-com:vml" xmlns:wp14="http://schemas.microsoft.com/office/word/2010/wordprocessingDrawing" xmlns:wp="http://schemas.openxmlformats.org/drawingml/2006/wordprocessingDrawing" xmlns:w10="urn:schemas-microsoft-com:office:word" xmlns:w="http://schemas.openxmlformats.org/wordprocessingml/2006/main" xmlns:w14="http://schemas.microsoft.com/office/word/2010/wordml" xmlns:w15="http://schemas.microsoft.com/office/word/2012/wordml" xmlns:wpg="http://schemas.microsoft.com/office/word/2010/wordprocessingGroup" xmlns:wpi="http://schemas.microsoft.com/office/word/2010/wordprocessingInk" xmlns:wne="http://schemas.microsoft.com/office/word/2006/wordml" xmlns:wps="http://schemas.microsoft.com/office/word/2010/wordprocessingShape" mc:Ignorable="w14 w15 wp14">
+  <w:displayBackgroundShape/>
+  <w:evenAndOddHeaders w:val="false"/>
+  <w:compat>
+    <w:compatSetting w:val="15" w:name="compatibilityMode" w:uri="http://schemas.microsoft.com/office/word"/>
+  </w:compat>
+</w:settings>
+</file>
+
+<file path=word\styles.xml><?xml version="1.0" encoding="utf-8"?>
 <w:styles xmlns:mc="http://schemas.openxmlformats.org/markup-compatibility/2006" xmlns:r="http://schemas.openxmlformats.org/officeDocument/2006/relationships" xmlns:w="http://schemas.openxmlformats.org/wordprocessingml/2006/main" xmlns:w14="http://schemas.microsoft.com/office/word/2010/wordml" xmlns:w15="http://schemas.microsoft.com/office/word/2012/wordml" mc:Ignorable="w14 w15">
   <w:docDefaults>
     <w:rPrDefault>

</xml_diff>